<commit_message>
Updated README and removed remaining references to FDS
</commit_message>
<xml_diff>
--- a/src/architecture/HLD.docx
+++ b/src/architecture/HLD.docx
@@ -7,7 +7,7 @@
         <w:pStyle w:val="Title"/>
       </w:pPr>
       <w:r>
-        <w:t xml:space="preserve">High-Level Design - Front Line Demand &amp; Supply (FDS)</w:t>
+        <w:t xml:space="preserve">High-Level Design Template</w:t>
       </w:r>
     </w:p>
     <w:p>
@@ -15,7 +15,7 @@
         <w:pStyle w:val="Date"/>
       </w:pPr>
       <w:r>
-        <w:t xml:space="preserve">2026-06-14</w:t>
+        <w:t xml:space="preserve">2026-06-15</w:t>
       </w:r>
     </w:p>
     <w:sdt>
@@ -109,36 +109,10 @@
       </w:pPr>
       <w:r>
         <w:rPr>
-          <w:b/>
-          <w:bCs/>
-          <w:i/>
-          <w:iCs/>
-        </w:rPr>
-        <w:t xml:space="preserve">Processing Sites Implementation</w:t>
-      </w:r>
-    </w:p>
-    <w:p>
-      <w:pPr>
-        <w:pStyle w:val="BodyText"/>
-      </w:pPr>
-      <w:r>
-        <w:rPr>
           <w:i/>
           <w:iCs/>
         </w:rPr>
         <w:t xml:space="preserve">Based on the arc42 Template, v9.0</w:t>
-      </w:r>
-    </w:p>
-    <w:p>
-      <w:pPr>
-        <w:pStyle w:val="BodyText"/>
-      </w:pPr>
-      <w:r>
-        <w:rPr>
-          <w:i/>
-          <w:iCs/>
-        </w:rPr>
-        <w:t xml:space="preserve">A worked-example reference document for Solution Architects across Royal Mail</w:t>
       </w:r>
     </w:p>
     <w:tbl>
@@ -4800,103 +4774,24 @@
           <w:tcPr/>
           <w:p>
             <w:pPr>
-              <w:jc w:val="left"/>
-            </w:pPr>
-            <w:r>
-              <w:t xml:space="preserve">NFAV001</w:t>
-            </w:r>
-          </w:p>
-        </w:tc>
-        <w:tc>
-          <w:tcPr/>
-          <w:p>
-            <w:pPr>
-              <w:jc w:val="left"/>
-            </w:pPr>
-            <w:r>
-              <w:t xml:space="preserve">The FDS solution shall be available for use and supported 24 hours a</w:t>
-            </w:r>
-            <w:r>
-              <w:t xml:space="preserve"> </w:t>
-            </w:r>
-            <w:r>
-              <w:t xml:space="preserve">day, 7 days a week, 365 days a year in adherence with the technical</w:t>
-            </w:r>
-            <w:r>
-              <w:t xml:space="preserve"> </w:t>
-            </w:r>
-            <w:r>
-              <w:t xml:space="preserve">design principles and standards applicable to Service Criticality Level</w:t>
-            </w:r>
-            <w:r>
-              <w:t xml:space="preserve"> </w:t>
-            </w:r>
-            <w:r>
-              <w:t xml:space="preserve">1.</w:t>
-            </w:r>
-          </w:p>
-          <w:p>
-            <w:pPr>
-              <w:jc w:val="left"/>
-            </w:pPr>
-            <w:r>
-              <w:t xml:space="preserve">As a mission-critical system supporting the payment of Variable Pay</w:t>
-            </w:r>
-            <w:r>
-              <w:t xml:space="preserve"> </w:t>
-            </w:r>
-            <w:r>
-              <w:t xml:space="preserve">Hours(over time), unplanned unavailability is not acceptable, and any</w:t>
-            </w:r>
-            <w:r>
-              <w:t xml:space="preserve"> </w:t>
-            </w:r>
-            <w:r>
-              <w:t xml:space="preserve">failure must be recovered within a maximum Recovery Time Objective of 24</w:t>
-            </w:r>
-            <w:r>
-              <w:t xml:space="preserve"> </w:t>
-            </w:r>
-            <w:r>
-              <w:t xml:space="preserve">hours(TBC with service).</w:t>
-            </w:r>
-          </w:p>
-          <w:p>
-            <w:pPr>
-              <w:jc w:val="left"/>
-            </w:pPr>
-            <w:r>
-              <w:t xml:space="preserve">The solution may only be taken offline outside of this commitment during</w:t>
-            </w:r>
-            <w:r>
-              <w:t xml:space="preserve"> </w:t>
-            </w:r>
-            <w:r>
-              <w:t xml:space="preserve">a planned maintenance window, agreed in advance with the Application</w:t>
-            </w:r>
-            <w:r>
-              <w:t xml:space="preserve"> </w:t>
-            </w:r>
-            <w:r>
-              <w:t xml:space="preserve">Service Manager, who shall notify the user community prior to any</w:t>
-            </w:r>
-            <w:r>
-              <w:t xml:space="preserve"> </w:t>
-            </w:r>
-            <w:r>
-              <w:t xml:space="preserve">scheduled downtime.</w:t>
-            </w:r>
-          </w:p>
-        </w:tc>
-        <w:tc>
-          <w:tcPr/>
-          <w:p>
-            <w:pPr>
-              <w:jc w:val="left"/>
-            </w:pPr>
-            <w:r>
-              <w:t xml:space="preserve">Approved</w:t>
-            </w:r>
+              <w:pStyle w:val="Compact"/>
+            </w:pPr>
+          </w:p>
+        </w:tc>
+        <w:tc>
+          <w:tcPr/>
+          <w:p>
+            <w:pPr>
+              <w:pStyle w:val="Compact"/>
+            </w:pPr>
+          </w:p>
+        </w:tc>
+        <w:tc>
+          <w:tcPr/>
+          <w:p>
+            <w:pPr>
+              <w:pStyle w:val="Compact"/>
+            </w:pPr>
           </w:p>
         </w:tc>
       </w:tr>

</xml_diff>

<commit_message>
fixed table format in Infrastructure Section and added generated documents
</commit_message>
<xml_diff>
--- a/src/architecture/HLD.docx
+++ b/src/architecture/HLD.docx
@@ -4100,7 +4100,7 @@
       </w:tr>
     </w:tbl>
     <w:bookmarkEnd w:id="46"/>
-    <w:bookmarkStart w:id="47" w:name="Xbd8f9e3c4d38a66a4d443ea7560cb23070bea70"/>
+    <w:bookmarkStart w:id="59" w:name="Xd409301cceaee48c2938953ec9f51e17849e3c4"/>
     <w:p>
       <w:pPr>
         <w:pStyle w:val="Heading3"/>
@@ -4115,29 +4115,187 @@
         <w:tab/>
       </w:r>
       <w:r>
-        <w:t xml:space="preserve">Quality and performance features:</w:t>
-      </w:r>
-    </w:p>
+        <w:t xml:space="preserve">Target Infrastructure Architecture</w:t>
+      </w:r>
+    </w:p>
+    <w:bookmarkStart w:id="47" w:name="X7a18e7353f80e2c7d1727bf699fd5e2d825f2d5"/>
+    <w:p>
+      <w:pPr>
+        <w:pStyle w:val="Heading4"/>
+      </w:pPr>
+      <w:r>
+        <w:rPr>
+          <w:rStyle w:val="SectionNumber"/>
+        </w:rPr>
+        <w:t xml:space="preserve">7.3.3.1</w:t>
+      </w:r>
+      <w:r>
+        <w:tab/>
+      </w:r>
+      <w:r>
+        <w:t xml:space="preserve">Platforms Summary</w:t>
+      </w:r>
+    </w:p>
+    <w:p>
+      <w:pPr>
+        <w:pStyle w:val="TableCaption"/>
+      </w:pPr>
+      <w:r>
+        <w:t xml:space="preserve">Platform Summary</w:t>
+      </w:r>
+    </w:p>
+    <w:tbl>
+      <w:tblPr>
+        <w:tblStyle w:val="Table"/>
+        <w:tblW w:type="pct" w:w="5000"/>
+        <w:tblLayout w:type="fixed"/>
+        <w:tblLook w:firstRow="1" w:lastRow="0" w:firstColumn="0" w:lastColumn="0" w:noHBand="0" w:noVBand="0" w:val="0020"/>
+        <w:tblCaption w:val="Platform Summary"/>
+      </w:tblPr>
+      <w:tblGrid>
+        <w:gridCol w:w="1584"/>
+        <w:gridCol w:w="3168"/>
+        <w:gridCol w:w="3168"/>
+      </w:tblGrid>
+      <w:tr>
+        <w:trPr>
+          <w:tblHeader w:val="on"/>
+        </w:trPr>
+        <w:tc>
+          <w:tcPr/>
+          <w:p>
+            <w:pPr>
+              <w:pStyle w:val="Compact"/>
+              <w:jc w:val="left"/>
+            </w:pPr>
+            <w:r>
+              <w:rPr>
+                <w:b/>
+                <w:bCs/>
+              </w:rPr>
+              <w:t xml:space="preserve">Platform</w:t>
+            </w:r>
+          </w:p>
+        </w:tc>
+        <w:tc>
+          <w:tcPr/>
+          <w:p>
+            <w:pPr>
+              <w:pStyle w:val="Compact"/>
+              <w:jc w:val="left"/>
+            </w:pPr>
+            <w:r>
+              <w:rPr>
+                <w:b/>
+                <w:bCs/>
+              </w:rPr>
+              <w:t xml:space="preserve">Purpose</w:t>
+            </w:r>
+          </w:p>
+        </w:tc>
+        <w:tc>
+          <w:tcPr/>
+          <w:p>
+            <w:pPr>
+              <w:pStyle w:val="Compact"/>
+              <w:jc w:val="left"/>
+            </w:pPr>
+            <w:r>
+              <w:rPr>
+                <w:b/>
+                <w:bCs/>
+              </w:rPr>
+              <w:t xml:space="preserve">Relevance</w:t>
+            </w:r>
+          </w:p>
+        </w:tc>
+      </w:tr>
+      <w:tr>
+        <w:tc>
+          <w:tcPr/>
+          <w:p>
+            <w:pPr>
+              <w:pStyle w:val="Compact"/>
+            </w:pPr>
+          </w:p>
+        </w:tc>
+        <w:tc>
+          <w:tcPr/>
+          <w:p>
+            <w:pPr>
+              <w:pStyle w:val="Compact"/>
+            </w:pPr>
+          </w:p>
+        </w:tc>
+        <w:tc>
+          <w:tcPr/>
+          <w:p>
+            <w:pPr>
+              <w:pStyle w:val="Compact"/>
+            </w:pPr>
+          </w:p>
+        </w:tc>
+      </w:tr>
+    </w:tbl>
     <w:bookmarkEnd w:id="47"/>
-    <w:bookmarkStart w:id="59" w:name="Xd409301cceaee48c2938953ec9f51e17849e3c4"/>
-    <w:p>
-      <w:pPr>
-        <w:pStyle w:val="Heading3"/>
+    <w:bookmarkStart w:id="50" w:name="Xe8490d4386b2c436c2731a92bffa20abfeafc32"/>
+    <w:p>
+      <w:pPr>
+        <w:pStyle w:val="Heading4"/>
       </w:pPr>
       <w:r>
         <w:rPr>
           <w:rStyle w:val="SectionNumber"/>
         </w:rPr>
-        <w:t xml:space="preserve">7.3.4</w:t>
+        <w:t xml:space="preserve">7.3.3.2</w:t>
       </w:r>
       <w:r>
         <w:tab/>
       </w:r>
       <w:r>
-        <w:t xml:space="preserve">Target Infrastructure Architecture</w:t>
-      </w:r>
-    </w:p>
-    <w:bookmarkStart w:id="48" w:name="X7a18e7353f80e2c7d1727bf699fd5e2d825f2d5"/>
+        <w:t xml:space="preserve">Load Balancers</w:t>
+      </w:r>
+    </w:p>
+    <w:bookmarkStart w:id="48" w:name="X3e7aa2429f5e36e9510394e108e33f0224bb025"/>
+    <w:p>
+      <w:pPr>
+        <w:pStyle w:val="Heading5"/>
+      </w:pPr>
+      <w:r>
+        <w:rPr>
+          <w:rStyle w:val="SectionNumber"/>
+        </w:rPr>
+        <w:t xml:space="preserve">7.3.3.2.1</w:t>
+      </w:r>
+      <w:r>
+        <w:tab/>
+      </w:r>
+      <w:r>
+        <w:t xml:space="preserve">Local Traffic Manager (LTM)</w:t>
+      </w:r>
+    </w:p>
+    <w:bookmarkEnd w:id="48"/>
+    <w:bookmarkStart w:id="49" w:name="X5ba98dfe55526eaaedf50044f873c17e4ed087a"/>
+    <w:p>
+      <w:pPr>
+        <w:pStyle w:val="Heading5"/>
+      </w:pPr>
+      <w:r>
+        <w:rPr>
+          <w:rStyle w:val="SectionNumber"/>
+        </w:rPr>
+        <w:t xml:space="preserve">7.3.3.2.2</w:t>
+      </w:r>
+      <w:r>
+        <w:tab/>
+      </w:r>
+      <w:r>
+        <w:t xml:space="preserve">Global Traffic Manager (GTM)</w:t>
+      </w:r>
+    </w:p>
+    <w:bookmarkEnd w:id="49"/>
+    <w:bookmarkEnd w:id="50"/>
+    <w:bookmarkStart w:id="51" w:name="Xf8a2b286451cf1f3f27adf30fe4e2789138fd25"/>
     <w:p>
       <w:pPr>
         <w:pStyle w:val="Heading4"/>
@@ -4146,17 +4304,17 @@
         <w:rPr>
           <w:rStyle w:val="SectionNumber"/>
         </w:rPr>
-        <w:t xml:space="preserve">7.3.4.1</w:t>
+        <w:t xml:space="preserve">7.3.3.3</w:t>
       </w:r>
       <w:r>
         <w:tab/>
       </w:r>
       <w:r>
-        <w:t xml:space="preserve">Platforms Summary</w:t>
-      </w:r>
-    </w:p>
-    <w:bookmarkEnd w:id="48"/>
-    <w:bookmarkStart w:id="49" w:name="Xe8490d4386b2c436c2731a92bffa20abfeafc32"/>
+        <w:t xml:space="preserve">IT Infrastructure Landscape View</w:t>
+      </w:r>
+    </w:p>
+    <w:bookmarkEnd w:id="51"/>
+    <w:bookmarkStart w:id="52" w:name="X34920bda0066b9d2e72d9b73fb8c4a0e71bf59e"/>
     <w:p>
       <w:pPr>
         <w:pStyle w:val="Heading4"/>
@@ -4165,17 +4323,243 @@
         <w:rPr>
           <w:rStyle w:val="SectionNumber"/>
         </w:rPr>
-        <w:t xml:space="preserve">7.3.4.2</w:t>
+        <w:t xml:space="preserve">7.3.3.4</w:t>
       </w:r>
       <w:r>
         <w:tab/>
       </w:r>
       <w:r>
-        <w:t xml:space="preserve">Load Balancers</w:t>
-      </w:r>
-    </w:p>
-    <w:bookmarkEnd w:id="49"/>
-    <w:bookmarkStart w:id="50" w:name="Xf8a2b286451cf1f3f27adf30fe4e2789138fd25"/>
+        <w:t xml:space="preserve">Compute (Physical / Virtual / Container)</w:t>
+      </w:r>
+    </w:p>
+    <w:p>
+      <w:pPr>
+        <w:pStyle w:val="TableCaption"/>
+      </w:pPr>
+      <w:r>
+        <w:t xml:space="preserve">Compute (Physical / Virtual / Container)</w:t>
+      </w:r>
+    </w:p>
+    <w:tbl>
+      <w:tblPr>
+        <w:tblStyle w:val="Table"/>
+        <w:tblW w:type="pct" w:w="5000"/>
+        <w:tblLayout w:type="fixed"/>
+        <w:tblLook w:firstRow="1" w:lastRow="0" w:firstColumn="0" w:lastColumn="0" w:noHBand="0" w:noVBand="0" w:val="0020"/>
+        <w:tblCaption w:val="Compute (Physical / Virtual / Container)"/>
+      </w:tblPr>
+      <w:tblGrid>
+        <w:gridCol w:w="1188"/>
+        <w:gridCol w:w="1188"/>
+        <w:gridCol w:w="1188"/>
+        <w:gridCol w:w="792"/>
+        <w:gridCol w:w="792"/>
+        <w:gridCol w:w="792"/>
+        <w:gridCol w:w="792"/>
+        <w:gridCol w:w="1188"/>
+      </w:tblGrid>
+      <w:tr>
+        <w:trPr>
+          <w:tblHeader w:val="on"/>
+        </w:trPr>
+        <w:tc>
+          <w:tcPr/>
+          <w:p>
+            <w:pPr>
+              <w:pStyle w:val="Compact"/>
+              <w:jc w:val="left"/>
+            </w:pPr>
+            <w:r>
+              <w:rPr>
+                <w:b/>
+                <w:bCs/>
+              </w:rPr>
+              <w:t xml:space="preserve">Host</w:t>
+            </w:r>
+          </w:p>
+        </w:tc>
+        <w:tc>
+          <w:tcPr/>
+          <w:p>
+            <w:pPr>
+              <w:pStyle w:val="Compact"/>
+              <w:jc w:val="left"/>
+            </w:pPr>
+            <w:r>
+              <w:rPr>
+                <w:b/>
+                <w:bCs/>
+              </w:rPr>
+              <w:t xml:space="preserve">App</w:t>
+            </w:r>
+          </w:p>
+        </w:tc>
+        <w:tc>
+          <w:tcPr/>
+          <w:p>
+            <w:pPr>
+              <w:pStyle w:val="Compact"/>
+              <w:jc w:val="left"/>
+            </w:pPr>
+            <w:r>
+              <w:rPr>
+                <w:b/>
+                <w:bCs/>
+              </w:rPr>
+              <w:t xml:space="preserve">OS</w:t>
+            </w:r>
+          </w:p>
+        </w:tc>
+        <w:tc>
+          <w:tcPr/>
+          <w:p>
+            <w:pPr>
+              <w:pStyle w:val="Compact"/>
+              <w:jc w:val="left"/>
+            </w:pPr>
+            <w:r>
+              <w:rPr>
+                <w:b/>
+                <w:bCs/>
+              </w:rPr>
+              <w:t xml:space="preserve">CPU</w:t>
+            </w:r>
+          </w:p>
+        </w:tc>
+        <w:tc>
+          <w:tcPr/>
+          <w:p>
+            <w:pPr>
+              <w:pStyle w:val="Compact"/>
+              <w:jc w:val="left"/>
+            </w:pPr>
+            <w:r>
+              <w:rPr>
+                <w:b/>
+                <w:bCs/>
+              </w:rPr>
+              <w:t xml:space="preserve">Mem</w:t>
+            </w:r>
+          </w:p>
+        </w:tc>
+        <w:tc>
+          <w:tcPr/>
+          <w:p>
+            <w:pPr>
+              <w:pStyle w:val="Compact"/>
+              <w:jc w:val="left"/>
+            </w:pPr>
+            <w:r>
+              <w:rPr>
+                <w:b/>
+                <w:bCs/>
+              </w:rPr>
+              <w:t xml:space="preserve">Disk</w:t>
+            </w:r>
+          </w:p>
+        </w:tc>
+        <w:tc>
+          <w:tcPr/>
+          <w:p>
+            <w:pPr>
+              <w:pStyle w:val="Compact"/>
+              <w:jc w:val="left"/>
+            </w:pPr>
+            <w:r>
+              <w:rPr>
+                <w:b/>
+                <w:bCs/>
+              </w:rPr>
+              <w:t xml:space="preserve">DC</w:t>
+            </w:r>
+          </w:p>
+        </w:tc>
+        <w:tc>
+          <w:tcPr/>
+          <w:p>
+            <w:pPr>
+              <w:pStyle w:val="Compact"/>
+              <w:jc w:val="left"/>
+            </w:pPr>
+            <w:r>
+              <w:rPr>
+                <w:b/>
+                <w:bCs/>
+              </w:rPr>
+              <w:t xml:space="preserve">Type</w:t>
+            </w:r>
+          </w:p>
+        </w:tc>
+      </w:tr>
+      <w:tr>
+        <w:tc>
+          <w:tcPr/>
+          <w:p>
+            <w:pPr>
+              <w:pStyle w:val="Compact"/>
+            </w:pPr>
+          </w:p>
+        </w:tc>
+        <w:tc>
+          <w:tcPr/>
+          <w:p>
+            <w:pPr>
+              <w:pStyle w:val="Compact"/>
+            </w:pPr>
+          </w:p>
+        </w:tc>
+        <w:tc>
+          <w:tcPr/>
+          <w:p>
+            <w:pPr>
+              <w:pStyle w:val="Compact"/>
+            </w:pPr>
+          </w:p>
+        </w:tc>
+        <w:tc>
+          <w:tcPr/>
+          <w:p>
+            <w:pPr>
+              <w:pStyle w:val="Compact"/>
+            </w:pPr>
+          </w:p>
+        </w:tc>
+        <w:tc>
+          <w:tcPr/>
+          <w:p>
+            <w:pPr>
+              <w:pStyle w:val="Compact"/>
+            </w:pPr>
+          </w:p>
+        </w:tc>
+        <w:tc>
+          <w:tcPr/>
+          <w:p>
+            <w:pPr>
+              <w:pStyle w:val="Compact"/>
+            </w:pPr>
+          </w:p>
+        </w:tc>
+        <w:tc>
+          <w:tcPr/>
+          <w:p>
+            <w:pPr>
+              <w:pStyle w:val="Compact"/>
+            </w:pPr>
+          </w:p>
+        </w:tc>
+        <w:tc>
+          <w:tcPr/>
+          <w:p>
+            <w:pPr>
+              <w:pStyle w:val="Compact"/>
+            </w:pPr>
+          </w:p>
+        </w:tc>
+      </w:tr>
+    </w:tbl>
+    <w:bookmarkEnd w:id="52"/>
+    <w:bookmarkStart w:id="53" w:name="X520b4e8fafae595b73a0d0568d106dc97fdd40c"/>
     <w:p>
       <w:pPr>
         <w:pStyle w:val="Heading4"/>
@@ -4184,17 +4568,243 @@
         <w:rPr>
           <w:rStyle w:val="SectionNumber"/>
         </w:rPr>
-        <w:t xml:space="preserve">7.3.4.3</w:t>
+        <w:t xml:space="preserve">7.3.3.5</w:t>
       </w:r>
       <w:r>
         <w:tab/>
       </w:r>
       <w:r>
-        <w:t xml:space="preserve">IT Infrastructure Landscape View</w:t>
-      </w:r>
-    </w:p>
-    <w:bookmarkEnd w:id="50"/>
-    <w:bookmarkStart w:id="51" w:name="Xc94ba73083c8840b7e6fd5193336660813c55a9"/>
+        <w:t xml:space="preserve">Databases</w:t>
+      </w:r>
+    </w:p>
+    <w:p>
+      <w:pPr>
+        <w:pStyle w:val="TableCaption"/>
+      </w:pPr>
+      <w:r>
+        <w:t xml:space="preserve">Database Servers (Physical / Virtual)</w:t>
+      </w:r>
+    </w:p>
+    <w:tbl>
+      <w:tblPr>
+        <w:tblStyle w:val="Table"/>
+        <w:tblW w:type="pct" w:w="5000"/>
+        <w:tblLayout w:type="fixed"/>
+        <w:tblLook w:firstRow="1" w:lastRow="0" w:firstColumn="0" w:lastColumn="0" w:noHBand="0" w:noVBand="0" w:val="0020"/>
+        <w:tblCaption w:val="Database Servers (Physical / Virtual)"/>
+      </w:tblPr>
+      <w:tblGrid>
+        <w:gridCol w:w="1188"/>
+        <w:gridCol w:w="1188"/>
+        <w:gridCol w:w="1188"/>
+        <w:gridCol w:w="792"/>
+        <w:gridCol w:w="792"/>
+        <w:gridCol w:w="792"/>
+        <w:gridCol w:w="792"/>
+        <w:gridCol w:w="1188"/>
+      </w:tblGrid>
+      <w:tr>
+        <w:trPr>
+          <w:tblHeader w:val="on"/>
+        </w:trPr>
+        <w:tc>
+          <w:tcPr/>
+          <w:p>
+            <w:pPr>
+              <w:pStyle w:val="Compact"/>
+              <w:jc w:val="left"/>
+            </w:pPr>
+            <w:r>
+              <w:rPr>
+                <w:b/>
+                <w:bCs/>
+              </w:rPr>
+              <w:t xml:space="preserve">Host</w:t>
+            </w:r>
+          </w:p>
+        </w:tc>
+        <w:tc>
+          <w:tcPr/>
+          <w:p>
+            <w:pPr>
+              <w:pStyle w:val="Compact"/>
+              <w:jc w:val="left"/>
+            </w:pPr>
+            <w:r>
+              <w:rPr>
+                <w:b/>
+                <w:bCs/>
+              </w:rPr>
+              <w:t xml:space="preserve">DB</w:t>
+            </w:r>
+          </w:p>
+        </w:tc>
+        <w:tc>
+          <w:tcPr/>
+          <w:p>
+            <w:pPr>
+              <w:pStyle w:val="Compact"/>
+              <w:jc w:val="left"/>
+            </w:pPr>
+            <w:r>
+              <w:rPr>
+                <w:b/>
+                <w:bCs/>
+              </w:rPr>
+              <w:t xml:space="preserve">OS</w:t>
+            </w:r>
+          </w:p>
+        </w:tc>
+        <w:tc>
+          <w:tcPr/>
+          <w:p>
+            <w:pPr>
+              <w:pStyle w:val="Compact"/>
+              <w:jc w:val="left"/>
+            </w:pPr>
+            <w:r>
+              <w:rPr>
+                <w:b/>
+                <w:bCs/>
+              </w:rPr>
+              <w:t xml:space="preserve">CPU</w:t>
+            </w:r>
+          </w:p>
+        </w:tc>
+        <w:tc>
+          <w:tcPr/>
+          <w:p>
+            <w:pPr>
+              <w:pStyle w:val="Compact"/>
+              <w:jc w:val="left"/>
+            </w:pPr>
+            <w:r>
+              <w:rPr>
+                <w:b/>
+                <w:bCs/>
+              </w:rPr>
+              <w:t xml:space="preserve">Mem</w:t>
+            </w:r>
+          </w:p>
+        </w:tc>
+        <w:tc>
+          <w:tcPr/>
+          <w:p>
+            <w:pPr>
+              <w:pStyle w:val="Compact"/>
+              <w:jc w:val="left"/>
+            </w:pPr>
+            <w:r>
+              <w:rPr>
+                <w:b/>
+                <w:bCs/>
+              </w:rPr>
+              <w:t xml:space="preserve">Disk</w:t>
+            </w:r>
+          </w:p>
+        </w:tc>
+        <w:tc>
+          <w:tcPr/>
+          <w:p>
+            <w:pPr>
+              <w:pStyle w:val="Compact"/>
+              <w:jc w:val="left"/>
+            </w:pPr>
+            <w:r>
+              <w:rPr>
+                <w:b/>
+                <w:bCs/>
+              </w:rPr>
+              <w:t xml:space="preserve">DC</w:t>
+            </w:r>
+          </w:p>
+        </w:tc>
+        <w:tc>
+          <w:tcPr/>
+          <w:p>
+            <w:pPr>
+              <w:pStyle w:val="Compact"/>
+              <w:jc w:val="left"/>
+            </w:pPr>
+            <w:r>
+              <w:rPr>
+                <w:b/>
+                <w:bCs/>
+              </w:rPr>
+              <w:t xml:space="preserve">Type</w:t>
+            </w:r>
+          </w:p>
+        </w:tc>
+      </w:tr>
+      <w:tr>
+        <w:tc>
+          <w:tcPr/>
+          <w:p>
+            <w:pPr>
+              <w:pStyle w:val="Compact"/>
+            </w:pPr>
+          </w:p>
+        </w:tc>
+        <w:tc>
+          <w:tcPr/>
+          <w:p>
+            <w:pPr>
+              <w:pStyle w:val="Compact"/>
+            </w:pPr>
+          </w:p>
+        </w:tc>
+        <w:tc>
+          <w:tcPr/>
+          <w:p>
+            <w:pPr>
+              <w:pStyle w:val="Compact"/>
+            </w:pPr>
+          </w:p>
+        </w:tc>
+        <w:tc>
+          <w:tcPr/>
+          <w:p>
+            <w:pPr>
+              <w:pStyle w:val="Compact"/>
+            </w:pPr>
+          </w:p>
+        </w:tc>
+        <w:tc>
+          <w:tcPr/>
+          <w:p>
+            <w:pPr>
+              <w:pStyle w:val="Compact"/>
+            </w:pPr>
+          </w:p>
+        </w:tc>
+        <w:tc>
+          <w:tcPr/>
+          <w:p>
+            <w:pPr>
+              <w:pStyle w:val="Compact"/>
+            </w:pPr>
+          </w:p>
+        </w:tc>
+        <w:tc>
+          <w:tcPr/>
+          <w:p>
+            <w:pPr>
+              <w:pStyle w:val="Compact"/>
+            </w:pPr>
+          </w:p>
+        </w:tc>
+        <w:tc>
+          <w:tcPr/>
+          <w:p>
+            <w:pPr>
+              <w:pStyle w:val="Compact"/>
+            </w:pPr>
+          </w:p>
+        </w:tc>
+      </w:tr>
+    </w:tbl>
+    <w:bookmarkEnd w:id="53"/>
+    <w:bookmarkStart w:id="54" w:name="X3eee702173a75e3a310c57da148c37e6cf781ac"/>
     <w:p>
       <w:pPr>
         <w:pStyle w:val="Heading4"/>
@@ -4203,17 +4813,17 @@
         <w:rPr>
           <w:rStyle w:val="SectionNumber"/>
         </w:rPr>
-        <w:t xml:space="preserve">7.3.4.4</w:t>
+        <w:t xml:space="preserve">7.3.3.6</w:t>
       </w:r>
       <w:r>
         <w:tab/>
       </w:r>
       <w:r>
-        <w:t xml:space="preserve">Physical Compute</w:t>
-      </w:r>
-    </w:p>
-    <w:bookmarkEnd w:id="51"/>
-    <w:bookmarkStart w:id="52" w:name="X520b4e8fafae595b73a0d0568d106dc97fdd40c"/>
+        <w:t xml:space="preserve">High Available Cluster</w:t>
+      </w:r>
+    </w:p>
+    <w:bookmarkEnd w:id="54"/>
+    <w:bookmarkStart w:id="55" w:name="X488062b6960e3f3e7e5dc1e7ebf2e348e619136"/>
     <w:p>
       <w:pPr>
         <w:pStyle w:val="Heading4"/>
@@ -4222,17 +4832,17 @@
         <w:rPr>
           <w:rStyle w:val="SectionNumber"/>
         </w:rPr>
-        <w:t xml:space="preserve">7.3.4.5</w:t>
+        <w:t xml:space="preserve">7.3.3.7</w:t>
       </w:r>
       <w:r>
         <w:tab/>
       </w:r>
       <w:r>
-        <w:t xml:space="preserve">Databases</w:t>
-      </w:r>
-    </w:p>
-    <w:bookmarkEnd w:id="52"/>
-    <w:bookmarkStart w:id="53" w:name="X3eee702173a75e3a310c57da148c37e6cf781ac"/>
+        <w:t xml:space="preserve">Network Attached Storage (NAS)</w:t>
+      </w:r>
+    </w:p>
+    <w:bookmarkEnd w:id="55"/>
+    <w:bookmarkStart w:id="57" w:name="X60c993c4c12b8a00c30878d713f7900226c2164"/>
     <w:p>
       <w:pPr>
         <w:pStyle w:val="Heading4"/>
@@ -4241,91 +4851,135 @@
         <w:rPr>
           <w:rStyle w:val="SectionNumber"/>
         </w:rPr>
-        <w:t xml:space="preserve">7.3.4.6</w:t>
+        <w:t xml:space="preserve">7.3.3.8</w:t>
       </w:r>
       <w:r>
         <w:tab/>
       </w:r>
       <w:r>
-        <w:t xml:space="preserve">High Available Cluster</w:t>
-      </w:r>
-    </w:p>
-    <w:bookmarkEnd w:id="53"/>
-    <w:bookmarkStart w:id="54" w:name="X488062b6960e3f3e7e5dc1e7ebf2e348e619136"/>
-    <w:p>
-      <w:pPr>
-        <w:pStyle w:val="Heading4"/>
+        <w:t xml:space="preserve">Network</w:t>
+      </w:r>
+    </w:p>
+    <w:bookmarkStart w:id="56" w:name="Xf5a60e4b166727f6037c010b4ecfe30978547a6"/>
+    <w:p>
+      <w:pPr>
+        <w:pStyle w:val="Heading5"/>
       </w:pPr>
       <w:r>
         <w:rPr>
           <w:rStyle w:val="SectionNumber"/>
         </w:rPr>
-        <w:t xml:space="preserve">7.3.4.7</w:t>
+        <w:t xml:space="preserve">7.3.3.8.1</w:t>
       </w:r>
       <w:r>
         <w:tab/>
       </w:r>
       <w:r>
-        <w:t xml:space="preserve">Network Attached Storage (NAS)</w:t>
-      </w:r>
-    </w:p>
-    <w:bookmarkEnd w:id="54"/>
-    <w:bookmarkStart w:id="55" w:name="X60c993c4c12b8a00c30878d713f7900226c2164"/>
-    <w:p>
-      <w:pPr>
-        <w:pStyle w:val="Heading4"/>
-      </w:pPr>
-      <w:r>
-        <w:rPr>
-          <w:rStyle w:val="SectionNumber"/>
-        </w:rPr>
-        <w:t xml:space="preserve">7.3.4.8</w:t>
-      </w:r>
-      <w:r>
-        <w:tab/>
-      </w:r>
-      <w:r>
-        <w:t xml:space="preserve">Network</w:t>
-      </w:r>
-    </w:p>
-    <w:bookmarkEnd w:id="55"/>
-    <w:bookmarkStart w:id="56" w:name="X3e7aa2429f5e36e9510394e108e33f0224bb025"/>
-    <w:p>
-      <w:pPr>
-        <w:pStyle w:val="Heading4"/>
-      </w:pPr>
-      <w:r>
-        <w:rPr>
-          <w:rStyle w:val="SectionNumber"/>
-        </w:rPr>
-        <w:t xml:space="preserve">7.3.4.9</w:t>
-      </w:r>
-      <w:r>
-        <w:tab/>
-      </w:r>
-      <w:r>
-        <w:t xml:space="preserve">Local Traffic Manager (LTM)</w:t>
-      </w:r>
-    </w:p>
+        <w:t xml:space="preserve">Network Protocols</w:t>
+      </w:r>
+    </w:p>
+    <w:p>
+      <w:pPr>
+        <w:pStyle w:val="TableCaption"/>
+      </w:pPr>
+      <w:r>
+        <w:t xml:space="preserve">Network Protocols</w:t>
+      </w:r>
+    </w:p>
+    <w:tbl>
+      <w:tblPr>
+        <w:tblStyle w:val="Table"/>
+        <w:tblW w:type="pct" w:w="5000"/>
+        <w:tblLayout w:type="fixed"/>
+        <w:tblLook w:firstRow="1" w:lastRow="0" w:firstColumn="0" w:lastColumn="0" w:noHBand="0" w:noVBand="0" w:val="0020"/>
+        <w:tblCaption w:val="Network Protocols"/>
+      </w:tblPr>
+      <w:tblGrid>
+        <w:gridCol w:w="1584"/>
+        <w:gridCol w:w="3168"/>
+        <w:gridCol w:w="3168"/>
+      </w:tblGrid>
+      <w:tr>
+        <w:trPr>
+          <w:tblHeader w:val="on"/>
+        </w:trPr>
+        <w:tc>
+          <w:tcPr/>
+          <w:p>
+            <w:pPr>
+              <w:pStyle w:val="Compact"/>
+              <w:jc w:val="left"/>
+            </w:pPr>
+            <w:r>
+              <w:rPr>
+                <w:b/>
+                <w:bCs/>
+              </w:rPr>
+              <w:t xml:space="preserve">Protocol</w:t>
+            </w:r>
+          </w:p>
+        </w:tc>
+        <w:tc>
+          <w:tcPr/>
+          <w:p>
+            <w:pPr>
+              <w:pStyle w:val="Compact"/>
+              <w:jc w:val="left"/>
+            </w:pPr>
+            <w:r>
+              <w:rPr>
+                <w:b/>
+                <w:bCs/>
+              </w:rPr>
+              <w:t xml:space="preserve">Purpose</w:t>
+            </w:r>
+          </w:p>
+        </w:tc>
+        <w:tc>
+          <w:tcPr/>
+          <w:p>
+            <w:pPr>
+              <w:pStyle w:val="Compact"/>
+              <w:jc w:val="left"/>
+            </w:pPr>
+            <w:r>
+              <w:rPr>
+                <w:b/>
+                <w:bCs/>
+              </w:rPr>
+              <w:t xml:space="preserve">EndPoints</w:t>
+            </w:r>
+          </w:p>
+        </w:tc>
+      </w:tr>
+      <w:tr>
+        <w:tc>
+          <w:tcPr/>
+          <w:p>
+            <w:pPr>
+              <w:pStyle w:val="Compact"/>
+            </w:pPr>
+          </w:p>
+        </w:tc>
+        <w:tc>
+          <w:tcPr/>
+          <w:p>
+            <w:pPr>
+              <w:pStyle w:val="Compact"/>
+            </w:pPr>
+          </w:p>
+        </w:tc>
+        <w:tc>
+          <w:tcPr/>
+          <w:p>
+            <w:pPr>
+              <w:pStyle w:val="Compact"/>
+            </w:pPr>
+          </w:p>
+        </w:tc>
+      </w:tr>
+    </w:tbl>
     <w:bookmarkEnd w:id="56"/>
-    <w:bookmarkStart w:id="57" w:name="X5ba98dfe55526eaaedf50044f873c17e4ed087a"/>
-    <w:p>
-      <w:pPr>
-        <w:pStyle w:val="Heading4"/>
-      </w:pPr>
-      <w:r>
-        <w:rPr>
-          <w:rStyle w:val="SectionNumber"/>
-        </w:rPr>
-        <w:t xml:space="preserve">7.3.4.10</w:t>
-      </w:r>
-      <w:r>
-        <w:tab/>
-      </w:r>
-      <w:r>
-        <w:t xml:space="preserve">Global Traffic Manager (GTM)</w:t>
-      </w:r>
-    </w:p>
     <w:bookmarkEnd w:id="57"/>
     <w:bookmarkStart w:id="58" w:name="X33c5ac9b3300ab24edaad8dad0e94b36b9a8779"/>
     <w:p>
@@ -4336,7 +4990,7 @@
         <w:rPr>
           <w:rStyle w:val="SectionNumber"/>
         </w:rPr>
-        <w:t xml:space="preserve">7.3.4.11</w:t>
+        <w:t xml:space="preserve">7.3.3.9</w:t>
       </w:r>
       <w:r>
         <w:tab/>

</xml_diff>